<commit_message>
Use professional centered ornament for scene breaks
Switch in-chapter scene breaks from blank-space gaps to a clean centered
"• • •" dinkus. Blank space alone is unreliable in reflowable Kindle
ebooks (a break landing at a screen edge becomes invisible); a visible
centered ornament survives pagination, per Kindle Publishing Guidelines.

- 63 in-chapter scene breaks now render as a centered "• • •".
- Title page and end-matter/colophon separators stay as plain spacing
  (a scene-break ornament is inappropriate there).
- Decorative under-heading separators remain removed; smart quotes retained.

Co-Authored-By: Claude Opus 4.8 <noreply@anthropic.com>
Claude-Session: https://claude.ai/code/session_01Mxv8mCjfxQK7Y46CctMrpr
</commit_message>
<xml_diff>
--- a/Free PayPal - A History of XRP (KDP-ready).docx
+++ b/Free PayPal - A History of XRP (KDP-ready).docx
@@ -938,7 +938,7 @@
         <w:jc w:val="center"/>
       </w:pPr>
       <w:r>
-        <w:t xml:space="preserve"> </w:t>
+        <w:t>• • •</w:t>
       </w:r>
     </w:p>
     <w:p>
@@ -1064,7 +1064,7 @@
         <w:jc w:val="center"/>
       </w:pPr>
       <w:r>
-        <w:t xml:space="preserve"> </w:t>
+        <w:t>• • •</w:t>
       </w:r>
     </w:p>
     <w:p>
@@ -1156,7 +1156,7 @@
         <w:jc w:val="center"/>
       </w:pPr>
       <w:r>
-        <w:t xml:space="preserve"> </w:t>
+        <w:t>• • •</w:t>
       </w:r>
     </w:p>
     <w:p>
@@ -1348,7 +1348,7 @@
         <w:jc w:val="center"/>
       </w:pPr>
       <w:r>
-        <w:t xml:space="preserve"> </w:t>
+        <w:t>• • •</w:t>
       </w:r>
     </w:p>
     <w:p>
@@ -1439,7 +1439,7 @@
         <w:jc w:val="center"/>
       </w:pPr>
       <w:r>
-        <w:t xml:space="preserve"> </w:t>
+        <w:t>• • •</w:t>
       </w:r>
     </w:p>
     <w:p>
@@ -1541,7 +1541,7 @@
         <w:jc w:val="center"/>
       </w:pPr>
       <w:r>
-        <w:t xml:space="preserve"> </w:t>
+        <w:t>• • •</w:t>
       </w:r>
     </w:p>
     <w:p>
@@ -1608,7 +1608,7 @@
         <w:jc w:val="center"/>
       </w:pPr>
       <w:r>
-        <w:t xml:space="preserve"> </w:t>
+        <w:t>• • •</w:t>
       </w:r>
     </w:p>
     <w:p>
@@ -1748,7 +1748,7 @@
         <w:jc w:val="center"/>
       </w:pPr>
       <w:r>
-        <w:t xml:space="preserve"> </w:t>
+        <w:t>• • •</w:t>
       </w:r>
     </w:p>
     <w:p>
@@ -1836,7 +1836,7 @@
         <w:jc w:val="center"/>
       </w:pPr>
       <w:r>
-        <w:t xml:space="preserve"> </w:t>
+        <w:t>• • •</w:t>
       </w:r>
     </w:p>
     <w:p>
@@ -1956,7 +1956,7 @@
         <w:jc w:val="center"/>
       </w:pPr>
       <w:r>
-        <w:t xml:space="preserve"> </w:t>
+        <w:t>• • •</w:t>
       </w:r>
     </w:p>
     <w:p>
@@ -2149,7 +2149,7 @@
         <w:jc w:val="center"/>
       </w:pPr>
       <w:r>
-        <w:t xml:space="preserve"> </w:t>
+        <w:t>• • •</w:t>
       </w:r>
     </w:p>
     <w:p>
@@ -2210,7 +2210,7 @@
         <w:jc w:val="center"/>
       </w:pPr>
       <w:r>
-        <w:t xml:space="preserve"> </w:t>
+        <w:t>• • •</w:t>
       </w:r>
     </w:p>
     <w:p>
@@ -2313,7 +2313,7 @@
         <w:jc w:val="center"/>
       </w:pPr>
       <w:r>
-        <w:t xml:space="preserve"> </w:t>
+        <w:t>• • •</w:t>
       </w:r>
     </w:p>
     <w:p>
@@ -2466,7 +2466,7 @@
         <w:jc w:val="center"/>
       </w:pPr>
       <w:r>
-        <w:t xml:space="preserve"> </w:t>
+        <w:t>• • •</w:t>
       </w:r>
     </w:p>
     <w:p>
@@ -2540,7 +2540,7 @@
         <w:jc w:val="center"/>
       </w:pPr>
       <w:r>
-        <w:t xml:space="preserve"> </w:t>
+        <w:t>• • •</w:t>
       </w:r>
     </w:p>
     <w:p>
@@ -2628,7 +2628,7 @@
         <w:jc w:val="center"/>
       </w:pPr>
       <w:r>
-        <w:t xml:space="preserve"> </w:t>
+        <w:t>• • •</w:t>
       </w:r>
     </w:p>
     <w:p>
@@ -2713,7 +2713,7 @@
         <w:jc w:val="center"/>
       </w:pPr>
       <w:r>
-        <w:t xml:space="preserve"> </w:t>
+        <w:t>• • •</w:t>
       </w:r>
     </w:p>
     <w:p>
@@ -2934,7 +2934,7 @@
         <w:jc w:val="center"/>
       </w:pPr>
       <w:r>
-        <w:t xml:space="preserve"> </w:t>
+        <w:t>• • •</w:t>
       </w:r>
     </w:p>
     <w:p>
@@ -3099,7 +3099,7 @@
         <w:jc w:val="center"/>
       </w:pPr>
       <w:r>
-        <w:t xml:space="preserve"> </w:t>
+        <w:t>• • •</w:t>
       </w:r>
     </w:p>
     <w:p>
@@ -3224,7 +3224,7 @@
         <w:jc w:val="center"/>
       </w:pPr>
       <w:r>
-        <w:t xml:space="preserve"> </w:t>
+        <w:t>• • •</w:t>
       </w:r>
     </w:p>
     <w:p>
@@ -3289,7 +3289,7 @@
         <w:jc w:val="center"/>
       </w:pPr>
       <w:r>
-        <w:t xml:space="preserve"> </w:t>
+        <w:t>• • •</w:t>
       </w:r>
     </w:p>
     <w:p>
@@ -3451,7 +3451,7 @@
         <w:jc w:val="center"/>
       </w:pPr>
       <w:r>
-        <w:t xml:space="preserve"> </w:t>
+        <w:t>• • •</w:t>
       </w:r>
     </w:p>
     <w:p>
@@ -3515,7 +3515,7 @@
       </w:pPr>
       <w:r>
         <w:lastRenderedPageBreak/>
-        <w:t xml:space="preserve"> </w:t>
+        <w:t>• • •</w:t>
       </w:r>
     </w:p>
     <w:p>
@@ -3604,7 +3604,7 @@
         <w:jc w:val="center"/>
       </w:pPr>
       <w:r>
-        <w:t xml:space="preserve"> </w:t>
+        <w:t>• • •</w:t>
       </w:r>
     </w:p>
     <w:p>
@@ -3792,7 +3792,7 @@
         <w:jc w:val="center"/>
       </w:pPr>
       <w:r>
-        <w:t xml:space="preserve"> </w:t>
+        <w:t>• • •</w:t>
       </w:r>
     </w:p>
     <w:p>
@@ -3843,7 +3843,7 @@
         <w:jc w:val="center"/>
       </w:pPr>
       <w:r>
-        <w:t xml:space="preserve"> </w:t>
+        <w:t>• • •</w:t>
       </w:r>
     </w:p>
     <w:p>
@@ -3947,7 +3947,7 @@
         <w:jc w:val="center"/>
       </w:pPr>
       <w:r>
-        <w:t xml:space="preserve"> </w:t>
+        <w:t>• • •</w:t>
       </w:r>
     </w:p>
     <w:p>
@@ -4088,7 +4088,7 @@
         <w:jc w:val="center"/>
       </w:pPr>
       <w:r>
-        <w:t xml:space="preserve"> </w:t>
+        <w:t>• • •</w:t>
       </w:r>
     </w:p>
     <w:p>
@@ -4192,7 +4192,7 @@
         <w:jc w:val="center"/>
       </w:pPr>
       <w:r>
-        <w:t xml:space="preserve"> </w:t>
+        <w:t>• • •</w:t>
       </w:r>
     </w:p>
     <w:p>
@@ -4288,7 +4288,7 @@
         <w:jc w:val="center"/>
       </w:pPr>
       <w:r>
-        <w:t xml:space="preserve"> </w:t>
+        <w:t>• • •</w:t>
       </w:r>
     </w:p>
     <w:p>
@@ -4378,7 +4378,7 @@
         <w:jc w:val="center"/>
       </w:pPr>
       <w:r>
-        <w:t xml:space="preserve"> </w:t>
+        <w:t>• • •</w:t>
       </w:r>
     </w:p>
     <w:p>
@@ -4572,7 +4572,7 @@
         <w:jc w:val="center"/>
       </w:pPr>
       <w:r>
-        <w:t xml:space="preserve"> </w:t>
+        <w:t>• • •</w:t>
       </w:r>
     </w:p>
     <w:p>
@@ -4686,7 +4686,7 @@
         <w:jc w:val="center"/>
       </w:pPr>
       <w:r>
-        <w:t xml:space="preserve"> </w:t>
+        <w:t>• • •</w:t>
       </w:r>
     </w:p>
     <w:p>
@@ -4777,7 +4777,7 @@
         <w:jc w:val="center"/>
       </w:pPr>
       <w:r>
-        <w:t xml:space="preserve"> </w:t>
+        <w:t>• • •</w:t>
       </w:r>
     </w:p>
     <w:p>
@@ -4897,7 +4897,7 @@
         <w:jc w:val="center"/>
       </w:pPr>
       <w:r>
-        <w:t xml:space="preserve"> </w:t>
+        <w:t>• • •</w:t>
       </w:r>
     </w:p>
     <w:p>
@@ -4968,7 +4968,7 @@
         <w:jc w:val="center"/>
       </w:pPr>
       <w:r>
-        <w:t xml:space="preserve"> </w:t>
+        <w:t>• • •</w:t>
       </w:r>
     </w:p>
     <w:p>
@@ -5079,7 +5079,7 @@
         <w:jc w:val="center"/>
       </w:pPr>
       <w:r>
-        <w:t xml:space="preserve"> </w:t>
+        <w:t>• • •</w:t>
       </w:r>
     </w:p>
     <w:p>
@@ -5265,7 +5265,7 @@
         <w:jc w:val="center"/>
       </w:pPr>
       <w:r>
-        <w:t xml:space="preserve"> </w:t>
+        <w:t>• • •</w:t>
       </w:r>
     </w:p>
     <w:p>
@@ -5448,7 +5448,7 @@
         <w:jc w:val="center"/>
       </w:pPr>
       <w:r>
-        <w:t xml:space="preserve"> </w:t>
+        <w:t>• • •</w:t>
       </w:r>
     </w:p>
     <w:p>
@@ -5581,7 +5581,7 @@
         <w:jc w:val="center"/>
       </w:pPr>
       <w:r>
-        <w:t xml:space="preserve"> </w:t>
+        <w:t>• • •</w:t>
       </w:r>
     </w:p>
     <w:p>
@@ -5661,7 +5661,7 @@
         <w:jc w:val="center"/>
       </w:pPr>
       <w:r>
-        <w:t xml:space="preserve"> </w:t>
+        <w:t>• • •</w:t>
       </w:r>
     </w:p>
     <w:p>
@@ -5752,7 +5752,7 @@
         <w:jc w:val="center"/>
       </w:pPr>
       <w:r>
-        <w:t xml:space="preserve"> </w:t>
+        <w:t>• • •</w:t>
       </w:r>
     </w:p>
     <w:p>
@@ -5853,7 +5853,7 @@
         <w:jc w:val="center"/>
       </w:pPr>
       <w:r>
-        <w:t xml:space="preserve"> </w:t>
+        <w:t>• • •</w:t>
       </w:r>
     </w:p>
     <w:p>
@@ -6007,7 +6007,7 @@
         <w:jc w:val="center"/>
       </w:pPr>
       <w:r>
-        <w:t xml:space="preserve"> </w:t>
+        <w:t>• • •</w:t>
       </w:r>
     </w:p>
     <w:p>
@@ -6088,7 +6088,7 @@
         <w:jc w:val="center"/>
       </w:pPr>
       <w:r>
-        <w:t xml:space="preserve"> </w:t>
+        <w:t>• • •</w:t>
       </w:r>
     </w:p>
     <w:p>
@@ -6193,7 +6193,7 @@
         <w:jc w:val="center"/>
       </w:pPr>
       <w:r>
-        <w:t xml:space="preserve"> </w:t>
+        <w:t>• • •</w:t>
       </w:r>
     </w:p>
     <w:p>
@@ -6312,7 +6312,7 @@
         <w:jc w:val="center"/>
       </w:pPr>
       <w:r>
-        <w:t xml:space="preserve"> </w:t>
+        <w:t>• • •</w:t>
       </w:r>
     </w:p>
     <w:p>
@@ -6382,7 +6382,7 @@
         <w:jc w:val="center"/>
       </w:pPr>
       <w:r>
-        <w:t xml:space="preserve"> </w:t>
+        <w:t>• • •</w:t>
       </w:r>
     </w:p>
     <w:p>
@@ -6472,7 +6472,7 @@
         <w:jc w:val="center"/>
       </w:pPr>
       <w:r>
-        <w:t xml:space="preserve"> </w:t>
+        <w:t>• • •</w:t>
       </w:r>
     </w:p>
     <w:p>
@@ -6512,7 +6512,7 @@
         <w:jc w:val="center"/>
       </w:pPr>
       <w:r>
-        <w:t xml:space="preserve"> </w:t>
+        <w:t>• • •</w:t>
       </w:r>
     </w:p>
     <w:p>
@@ -6665,7 +6665,7 @@
         <w:jc w:val="center"/>
       </w:pPr>
       <w:r>
-        <w:t xml:space="preserve"> </w:t>
+        <w:t>• • •</w:t>
       </w:r>
     </w:p>
     <w:p>
@@ -6767,7 +6767,7 @@
         <w:jc w:val="center"/>
       </w:pPr>
       <w:r>
-        <w:t xml:space="preserve"> </w:t>
+        <w:t>• • •</w:t>
       </w:r>
     </w:p>
     <w:p>
@@ -6857,7 +6857,7 @@
         <w:jc w:val="center"/>
       </w:pPr>
       <w:r>
-        <w:t xml:space="preserve"> </w:t>
+        <w:t>• • •</w:t>
       </w:r>
     </w:p>
     <w:p>
@@ -6934,7 +6934,7 @@
         <w:jc w:val="center"/>
       </w:pPr>
       <w:r>
-        <w:t xml:space="preserve"> </w:t>
+        <w:t>• • •</w:t>
       </w:r>
     </w:p>
     <w:p>
@@ -7017,7 +7017,7 @@
         <w:jc w:val="center"/>
       </w:pPr>
       <w:r>
-        <w:t xml:space="preserve"> </w:t>
+        <w:t>• • •</w:t>
       </w:r>
     </w:p>
     <w:p>
@@ -7122,7 +7122,7 @@
         <w:jc w:val="center"/>
       </w:pPr>
       <w:r>
-        <w:t xml:space="preserve"> </w:t>
+        <w:t>• • •</w:t>
       </w:r>
     </w:p>
     <w:p>
@@ -7245,7 +7245,7 @@
         <w:jc w:val="center"/>
       </w:pPr>
       <w:r>
-        <w:t xml:space="preserve"> </w:t>
+        <w:t>• • •</w:t>
       </w:r>
     </w:p>
     <w:p>
@@ -7439,7 +7439,7 @@
         <w:jc w:val="center"/>
       </w:pPr>
       <w:r>
-        <w:t xml:space="preserve"> </w:t>
+        <w:t>• • •</w:t>
       </w:r>
     </w:p>
     <w:p>
@@ -7509,7 +7509,7 @@
         <w:jc w:val="center"/>
       </w:pPr>
       <w:r>
-        <w:t xml:space="preserve"> </w:t>
+        <w:t>• • •</w:t>
       </w:r>
     </w:p>
     <w:p>
@@ -7559,7 +7559,7 @@
       </w:pPr>
       <w:r>
         <w:lastRenderedPageBreak/>
-        <w:t xml:space="preserve"> </w:t>
+        <w:t>• • •</w:t>
       </w:r>
     </w:p>
     <w:p>
@@ -7671,7 +7671,7 @@
         <w:jc w:val="center"/>
       </w:pPr>
       <w:r>
-        <w:t xml:space="preserve"> </w:t>
+        <w:t>• • •</w:t>
       </w:r>
     </w:p>
     <w:p>
@@ -7794,7 +7794,7 @@
         <w:jc w:val="center"/>
       </w:pPr>
       <w:r>
-        <w:t xml:space="preserve"> </w:t>
+        <w:t>• • •</w:t>
       </w:r>
     </w:p>
     <w:p>
@@ -7845,7 +7845,7 @@
         <w:jc w:val="center"/>
       </w:pPr>
       <w:r>
-        <w:t xml:space="preserve"> </w:t>
+        <w:t>• • •</w:t>
       </w:r>
     </w:p>
     <w:p>

</xml_diff>